<commit_message>
Apostila: figuras ABNT reais dos 6 exercícios
Co-Authored-By: Claude Opus 5.5 <noreply@anthropic.com>
</commit_message>
<xml_diff>
--- a/apostila/apostila.docx
+++ b/apostila/apostila.docx
@@ -13221,7 +13221,7 @@
     </w:p>
     <w:bookmarkEnd w:id="71"/>
     <w:bookmarkEnd w:id="72"/>
-    <w:bookmarkStart w:id="81" w:name="mão-na-massa-no-gemini"/>
+    <w:bookmarkStart w:id="99" w:name="mão-na-massa-no-gemini"/>
     <w:p>
       <w:pPr>
         <w:pStyle w:val="Heading1"/>
@@ -14095,7 +14095,7 @@
       </w:r>
     </w:p>
     <w:bookmarkEnd w:id="73"/>
-    <w:bookmarkStart w:id="74" w:name="Xf144a8b13b3fdfc63edd5a5f2a1d255ec6aca89"/>
+    <w:bookmarkStart w:id="77" w:name="Xf144a8b13b3fdfc63edd5a5f2a1d255ec6aca89"/>
     <w:p>
       <w:pPr>
         <w:pStyle w:val="Heading2"/>
@@ -15100,6 +15100,77 @@
     </w:p>
     <w:p>
       <w:pPr>
+        <w:pStyle w:val="BodyText"/>
+      </w:pPr>
+      <w:r>
+        <w:t xml:space="preserve">As médias da Tabela 2, com as letras do teste de Tukey, estão na Figura 1.</w:t>
+      </w:r>
+    </w:p>
+    <w:p>
+      <w:pPr>
+        <w:pStyle w:val="TableCaption"/>
+      </w:pPr>
+      <w:r>
+        <w:t xml:space="preserve">Figura 1 – Altura média de mudas de ipê-amarelo (cm) aos 120 dias, em função do substrato</w:t>
+      </w:r>
+    </w:p>
+    <w:p>
+      <w:pPr>
+        <w:pStyle w:val="Figure"/>
+      </w:pPr>
+      <w:r>
+        <w:drawing>
+          <wp:inline>
+            <wp:extent cx="5334000" cy="2832187"/>
+            <wp:effectExtent b="0" l="0" r="0" t="0"/>
+            <wp:docPr descr="Gráfico de barras da altura média das mudas por substrato, com as letras do teste de Tukey" title="" id="75" name="Picture"/>
+            <a:graphic>
+              <a:graphicData uri="http://schemas.openxmlformats.org/drawingml/2006/picture">
+                <pic:pic>
+                  <pic:nvPicPr>
+                    <pic:cNvPr descr="figuras/fig_dic_mudas.png" id="76" name="Picture"/>
+                    <pic:cNvPicPr>
+                      <a:picLocks noChangeArrowheads="1" noChangeAspect="1"/>
+                    </pic:cNvPicPr>
+                  </pic:nvPicPr>
+                  <pic:blipFill>
+                    <a:blip r:embed="rId74"/>
+                    <a:stretch>
+                      <a:fillRect/>
+                    </a:stretch>
+                  </pic:blipFill>
+                  <pic:spPr bwMode="auto">
+                    <a:xfrm>
+                      <a:off x="0" y="0"/>
+                      <a:ext cx="5334000" cy="2832187"/>
+                    </a:xfrm>
+                    <a:prstGeom prst="rect">
+                      <a:avLst/>
+                    </a:prstGeom>
+                    <a:noFill/>
+                    <a:ln w="9525">
+                      <a:noFill/>
+                      <a:headEnd/>
+                      <a:tailEnd/>
+                    </a:ln>
+                  </pic:spPr>
+                </pic:pic>
+              </a:graphicData>
+            </a:graphic>
+          </wp:inline>
+        </w:drawing>
+      </w:r>
+    </w:p>
+    <w:p>
+      <w:pPr>
+        <w:pStyle w:val="Fontedatabela"/>
+      </w:pPr>
+      <w:r>
+        <w:t xml:space="preserve">Fonte: dados fictícios do curso (2026).</w:t>
+      </w:r>
+    </w:p>
+    <w:p>
+      <w:pPr>
         <w:pStyle w:val="Compact"/>
         <w:numPr>
           <w:ilvl w:val="0"/>
@@ -15170,8 +15241,8 @@
         <w:t xml:space="preserve">.</w:t>
       </w:r>
     </w:p>
-    <w:bookmarkEnd w:id="74"/>
-    <w:bookmarkStart w:id="75" w:name="Xcd73744d582eadd9f26e81a37f5f7ab2e56fa37"/>
+    <w:bookmarkEnd w:id="77"/>
+    <w:bookmarkStart w:id="81" w:name="Xcd73744d582eadd9f26e81a37f5f7ab2e56fa37"/>
     <w:p>
       <w:pPr>
         <w:pStyle w:val="Heading2"/>
@@ -16107,6 +16178,77 @@
     </w:p>
     <w:p>
       <w:pPr>
+        <w:pStyle w:val="BodyText"/>
+      </w:pPr>
+      <w:r>
+        <w:t xml:space="preserve">A Figura 2 mostra as mesmas médias em forma de gráfico.</w:t>
+      </w:r>
+    </w:p>
+    <w:p>
+      <w:pPr>
+        <w:pStyle w:val="TableCaption"/>
+      </w:pPr>
+      <w:r>
+        <w:t xml:space="preserve">Figura 2 – Produtividade média de cultivares de milho (kg ha⁻¹) em aleias de gliricídia</w:t>
+      </w:r>
+    </w:p>
+    <w:p>
+      <w:pPr>
+        <w:pStyle w:val="Figure"/>
+      </w:pPr>
+      <w:r>
+        <w:drawing>
+          <wp:inline>
+            <wp:extent cx="5334000" cy="2832187"/>
+            <wp:effectExtent b="0" l="0" r="0" t="0"/>
+            <wp:docPr descr="Gráfico de barras da produtividade média por cultivar de milho, com as letras do teste de Tukey" title="" id="79" name="Picture"/>
+            <a:graphic>
+              <a:graphicData uri="http://schemas.openxmlformats.org/drawingml/2006/picture">
+                <pic:pic>
+                  <pic:nvPicPr>
+                    <pic:cNvPr descr="figuras/fig_dbc_milho.png" id="80" name="Picture"/>
+                    <pic:cNvPicPr>
+                      <a:picLocks noChangeArrowheads="1" noChangeAspect="1"/>
+                    </pic:cNvPicPr>
+                  </pic:nvPicPr>
+                  <pic:blipFill>
+                    <a:blip r:embed="rId78"/>
+                    <a:stretch>
+                      <a:fillRect/>
+                    </a:stretch>
+                  </pic:blipFill>
+                  <pic:spPr bwMode="auto">
+                    <a:xfrm>
+                      <a:off x="0" y="0"/>
+                      <a:ext cx="5334000" cy="2832187"/>
+                    </a:xfrm>
+                    <a:prstGeom prst="rect">
+                      <a:avLst/>
+                    </a:prstGeom>
+                    <a:noFill/>
+                    <a:ln w="9525">
+                      <a:noFill/>
+                      <a:headEnd/>
+                      <a:tailEnd/>
+                    </a:ln>
+                  </pic:spPr>
+                </pic:pic>
+              </a:graphicData>
+            </a:graphic>
+          </wp:inline>
+        </w:drawing>
+      </w:r>
+    </w:p>
+    <w:p>
+      <w:pPr>
+        <w:pStyle w:val="Fontedatabela"/>
+      </w:pPr>
+      <w:r>
+        <w:t xml:space="preserve">Fonte: dados fictícios do curso (2026).</w:t>
+      </w:r>
+    </w:p>
+    <w:p>
+      <w:pPr>
         <w:pStyle w:val="Compact"/>
         <w:numPr>
           <w:ilvl w:val="0"/>
@@ -16216,8 +16358,8 @@
         <w:t xml:space="preserve">) testou a homogeneidade pelo teste de O’Neill-Mathews (p = 0,50). O Gemini provavelmente usará Bartlett ou Levene, com p-valor diferente; o importante é a conclusão (variâncias homogêneas).</w:t>
       </w:r>
     </w:p>
-    <w:bookmarkEnd w:id="75"/>
-    <w:bookmarkStart w:id="76" w:name="X06aa590fe1e842f50f5c766fafbf44c9a0a988c"/>
+    <w:bookmarkEnd w:id="81"/>
+    <w:bookmarkStart w:id="85" w:name="X06aa590fe1e842f50f5c766fafbf44c9a0a988c"/>
     <w:p>
       <w:pPr>
         <w:pStyle w:val="Heading2"/>
@@ -17484,6 +17626,77 @@
         <w:pStyle w:val="BodyText"/>
       </w:pPr>
       <w:r>
+        <w:t xml:space="preserve">O gráfico de interação (Figura 3) mostra por que é preciso desdobrar: as linhas das espécies não são paralelas.</w:t>
+      </w:r>
+    </w:p>
+    <w:p>
+      <w:pPr>
+        <w:pStyle w:val="TableCaption"/>
+      </w:pPr>
+      <w:r>
+        <w:t xml:space="preserve">Figura 3 – Massa seca média de mudas (g) aos 6 meses, por espécie florestal e adubação</w:t>
+      </w:r>
+    </w:p>
+    <w:p>
+      <w:pPr>
+        <w:pStyle w:val="Figure"/>
+      </w:pPr>
+      <w:r>
+        <w:drawing>
+          <wp:inline>
+            <wp:extent cx="5334000" cy="2832187"/>
+            <wp:effectExtent b="0" l="0" r="0" t="0"/>
+            <wp:docPr descr="Gráfico de interação: massa seca por adubação, com uma linha para cada espécie" title="" id="83" name="Picture"/>
+            <a:graphic>
+              <a:graphicData uri="http://schemas.openxmlformats.org/drawingml/2006/picture">
+                <pic:pic>
+                  <pic:nvPicPr>
+                    <pic:cNvPr descr="figuras/fig_fatorial.png" id="84" name="Picture"/>
+                    <pic:cNvPicPr>
+                      <a:picLocks noChangeArrowheads="1" noChangeAspect="1"/>
+                    </pic:cNvPicPr>
+                  </pic:nvPicPr>
+                  <pic:blipFill>
+                    <a:blip r:embed="rId82"/>
+                    <a:stretch>
+                      <a:fillRect/>
+                    </a:stretch>
+                  </pic:blipFill>
+                  <pic:spPr bwMode="auto">
+                    <a:xfrm>
+                      <a:off x="0" y="0"/>
+                      <a:ext cx="5334000" cy="2832187"/>
+                    </a:xfrm>
+                    <a:prstGeom prst="rect">
+                      <a:avLst/>
+                    </a:prstGeom>
+                    <a:noFill/>
+                    <a:ln w="9525">
+                      <a:noFill/>
+                      <a:headEnd/>
+                      <a:tailEnd/>
+                    </a:ln>
+                  </pic:spPr>
+                </pic:pic>
+              </a:graphicData>
+            </a:graphic>
+          </wp:inline>
+        </w:drawing>
+      </w:r>
+    </w:p>
+    <w:p>
+      <w:pPr>
+        <w:pStyle w:val="Fontedatabela"/>
+      </w:pPr>
+      <w:r>
+        <w:t xml:space="preserve">Fonte: dados fictícios do curso (2026).</w:t>
+      </w:r>
+    </w:p>
+    <w:p>
+      <w:pPr>
+        <w:pStyle w:val="BodyText"/>
+      </w:pPr>
+      <w:r>
         <w:rPr>
           <w:b/>
           <w:bCs/>
@@ -17550,8 +17763,8 @@
         <w:t xml:space="preserve">a interação. Com interação significativa, essa conclusão é incompleta. Se acontecer, peça o desdobramento.</w:t>
       </w:r>
     </w:p>
-    <w:bookmarkEnd w:id="76"/>
-    <w:bookmarkStart w:id="77" w:name="X72edd4c88c221926afa1383b8a95ee62b60538c"/>
+    <w:bookmarkEnd w:id="85"/>
+    <w:bookmarkStart w:id="89" w:name="X72edd4c88c221926afa1383b8a95ee62b60538c"/>
     <w:p>
       <w:pPr>
         <w:pStyle w:val="Heading2"/>
@@ -18952,6 +19165,77 @@
         <w:pStyle w:val="BodyText"/>
       </w:pPr>
       <w:r>
+        <w:t xml:space="preserve">A Figura 4 compara as cultivares dentro de cada nível de sombreamento.</w:t>
+      </w:r>
+    </w:p>
+    <w:p>
+      <w:pPr>
+        <w:pStyle w:val="TableCaption"/>
+      </w:pPr>
+      <w:r>
+        <w:t xml:space="preserve">Figura 4 – Produtividade média de cultivares de café (sc ha⁻¹) em cada nível de sombreamento</w:t>
+      </w:r>
+    </w:p>
+    <w:p>
+      <w:pPr>
+        <w:pStyle w:val="Figure"/>
+      </w:pPr>
+      <w:r>
+        <w:drawing>
+          <wp:inline>
+            <wp:extent cx="5334000" cy="2832187"/>
+            <wp:effectExtent b="0" l="0" r="0" t="0"/>
+            <wp:docPr descr="Gráfico de barras agrupadas da produtividade de cada cultivar de café em 0, 30 e 50 % de sombreamento" title="" id="87" name="Picture"/>
+            <a:graphic>
+              <a:graphicData uri="http://schemas.openxmlformats.org/drawingml/2006/picture">
+                <pic:pic>
+                  <pic:nvPicPr>
+                    <pic:cNvPr descr="figuras/fig_cafe.png" id="88" name="Picture"/>
+                    <pic:cNvPicPr>
+                      <a:picLocks noChangeArrowheads="1" noChangeAspect="1"/>
+                    </pic:cNvPicPr>
+                  </pic:nvPicPr>
+                  <pic:blipFill>
+                    <a:blip r:embed="rId86"/>
+                    <a:stretch>
+                      <a:fillRect/>
+                    </a:stretch>
+                  </pic:blipFill>
+                  <pic:spPr bwMode="auto">
+                    <a:xfrm>
+                      <a:off x="0" y="0"/>
+                      <a:ext cx="5334000" cy="2832187"/>
+                    </a:xfrm>
+                    <a:prstGeom prst="rect">
+                      <a:avLst/>
+                    </a:prstGeom>
+                    <a:noFill/>
+                    <a:ln w="9525">
+                      <a:noFill/>
+                      <a:headEnd/>
+                      <a:tailEnd/>
+                    </a:ln>
+                  </pic:spPr>
+                </pic:pic>
+              </a:graphicData>
+            </a:graphic>
+          </wp:inline>
+        </w:drawing>
+      </w:r>
+    </w:p>
+    <w:p>
+      <w:pPr>
+        <w:pStyle w:val="Fontedatabela"/>
+      </w:pPr>
+      <w:r>
+        <w:t xml:space="preserve">Fonte: dados fictícios do curso (2026).</w:t>
+      </w:r>
+    </w:p>
+    <w:p>
+      <w:pPr>
+        <w:pStyle w:val="BodyText"/>
+      </w:pPr>
+      <w:r>
         <w:rPr>
           <w:b/>
           <w:bCs/>
@@ -19012,8 +19296,8 @@
         <w:t xml:space="preserve">, porque ela testou a parcela com o erro errado. Isso faz o sombreamento parecer muito mais importante do que é. Esse é o tipo de erro que só quem confere percebe.</w:t>
       </w:r>
     </w:p>
-    <w:bookmarkEnd w:id="77"/>
-    <w:bookmarkStart w:id="78" w:name="Xbcfb084397d523a42e4491f566796f145181408"/>
+    <w:bookmarkEnd w:id="89"/>
+    <w:bookmarkStart w:id="93" w:name="Xbcfb084397d523a42e4491f566796f145181408"/>
     <w:p>
       <w:pPr>
         <w:pStyle w:val="Heading2"/>
@@ -20269,7 +20553,7 @@
         <w:pStyle w:val="Fontedatabela"/>
       </w:pPr>
       <w:r>
-        <w:t xml:space="preserve">Nota: Por ser um fator quantitativo, as doses não foram comparadas por teste de médias; a resposta está descrita pela equação de regressão (Figura 1).</w:t>
+        <w:t xml:space="preserve">Nota: Por ser um fator quantitativo, as doses não foram comparadas por teste de médias; a resposta está descrita pela equação de regressão (Figura 5).</w:t>
       </w:r>
     </w:p>
     <w:p>
@@ -20277,7 +20561,62 @@
         <w:pStyle w:val="TableCaption"/>
       </w:pPr>
       <w:r>
-        <w:t xml:space="preserve">Figura 1 – Volume de madeira de eucalipto (m³ ha⁻¹) em função da dose de nitrogênio em cobertura (kg ha⁻¹)</w:t>
+        <w:t xml:space="preserve">Figura 5 – Volume de madeira de eucalipto (m³ ha⁻¹) em função da dose de nitrogênio em cobertura (kg ha⁻¹)</w:t>
+      </w:r>
+    </w:p>
+    <w:p>
+      <w:pPr>
+        <w:pStyle w:val="Figure"/>
+      </w:pPr>
+      <w:r>
+        <w:drawing>
+          <wp:inline>
+            <wp:extent cx="5334000" cy="2998786"/>
+            <wp:effectExtent b="0" l="0" r="0" t="0"/>
+            <wp:docPr descr="Gráfico de pontos das médias de volume por dose de N, com a curva quadrática ajustada e a linha da DMET" title="" id="91" name="Picture"/>
+            <a:graphic>
+              <a:graphicData uri="http://schemas.openxmlformats.org/drawingml/2006/picture">
+                <pic:pic>
+                  <pic:nvPicPr>
+                    <pic:cNvPr descr="figuras/fig_doses.png" id="92" name="Picture"/>
+                    <pic:cNvPicPr>
+                      <a:picLocks noChangeArrowheads="1" noChangeAspect="1"/>
+                    </pic:cNvPicPr>
+                  </pic:nvPicPr>
+                  <pic:blipFill>
+                    <a:blip r:embed="rId90"/>
+                    <a:stretch>
+                      <a:fillRect/>
+                    </a:stretch>
+                  </pic:blipFill>
+                  <pic:spPr bwMode="auto">
+                    <a:xfrm>
+                      <a:off x="0" y="0"/>
+                      <a:ext cx="5334000" cy="2998786"/>
+                    </a:xfrm>
+                    <a:prstGeom prst="rect">
+                      <a:avLst/>
+                    </a:prstGeom>
+                    <a:noFill/>
+                    <a:ln w="9525">
+                      <a:noFill/>
+                      <a:headEnd/>
+                      <a:tailEnd/>
+                    </a:ln>
+                  </pic:spPr>
+                </pic:pic>
+              </a:graphicData>
+            </a:graphic>
+          </wp:inline>
+        </w:drawing>
+      </w:r>
+    </w:p>
+    <w:p>
+      <w:pPr>
+        <w:pStyle w:val="Fontedatabela"/>
+      </w:pPr>
+      <w:r>
+        <w:t xml:space="preserve">Fonte: dados fictícios do curso (2026).</w:t>
       </w:r>
     </w:p>
     <w:p>
@@ -20289,13 +20628,13 @@
           <w:b/>
           <w:bCs/>
         </w:rPr>
-        <w:t xml:space="preserve">O que o gráfico deve mostrar:</w:t>
-      </w:r>
-      <w:r>
-        <w:t xml:space="preserve"> </w:t>
-      </w:r>
-      <w:r>
-        <w:t xml:space="preserve">os 5 pontos das médias da Tabela 10 e a curva ajustada</w:t>
+        <w:t xml:space="preserve">O que conferir no gráfico que a IA gerar:</w:t>
+      </w:r>
+      <w:r>
+        <w:t xml:space="preserve"> </w:t>
+      </w:r>
+      <w:r>
+        <w:t xml:space="preserve">os mesmos elementos da Figura 5: os 5 pontos das médias da Tabela 10 e a curva ajustada</w:t>
       </w:r>
       <w:r>
         <w:t xml:space="preserve"> </w:t>
@@ -20391,14 +20730,6 @@
       </w:r>
       <w:r>
         <w:t xml:space="preserve">da imagem, e a fonte vai abaixo.</w:t>
-      </w:r>
-    </w:p>
-    <w:p>
-      <w:pPr>
-        <w:pStyle w:val="Fontedatabela"/>
-      </w:pPr>
-      <w:r>
-        <w:t xml:space="preserve">Fonte: dados fictícios do curso (2026).</w:t>
       </w:r>
     </w:p>
     <w:p>
@@ -20604,8 +20935,8 @@
         <w:t xml:space="preserve">dos tratamentos (R² = 0,99 no quadrático; 0,85 no linear). Se a IA ajustar a curva sobre as 20 parcelas individuais, o R² será menor (≈ 0,89), com a mesma equação. Os dois estão certos; só informe no relatório qual foi usado.</w:t>
       </w:r>
     </w:p>
-    <w:bookmarkEnd w:id="78"/>
-    <w:bookmarkStart w:id="79" w:name="X04b6682d4815a8e41541de2cdc2c617f2415daf"/>
+    <w:bookmarkEnd w:id="93"/>
+    <w:bookmarkStart w:id="97" w:name="X04b6682d4815a8e41541de2cdc2c617f2415daf"/>
     <w:p>
       <w:pPr>
         <w:pStyle w:val="Heading2"/>
@@ -21917,6 +22248,77 @@
     </w:p>
     <w:p>
       <w:pPr>
+        <w:pStyle w:val="BodyText"/>
+      </w:pPr>
+      <w:r>
+        <w:t xml:space="preserve">Na Figura 6, os dados originais de cada armadilha mostram a variância crescendo junto com a média.</w:t>
+      </w:r>
+    </w:p>
+    <w:p>
+      <w:pPr>
+        <w:pStyle w:val="TableCaption"/>
+      </w:pPr>
+      <w:r>
+        <w:t xml:space="preserve">Figura 6 – Número de insetos-praga por armadilha (dados originais), em função do manejo</w:t>
+      </w:r>
+    </w:p>
+    <w:p>
+      <w:pPr>
+        <w:pStyle w:val="Figure"/>
+      </w:pPr>
+      <w:r>
+        <w:drawing>
+          <wp:inline>
+            <wp:extent cx="5334000" cy="2998786"/>
+            <wp:effectExtent b="0" l="0" r="0" t="0"/>
+            <wp:docPr descr="Boxplots do número de insetos-praga por manejo, com os pontos de cada armadilha" title="" id="95" name="Picture"/>
+            <a:graphic>
+              <a:graphicData uri="http://schemas.openxmlformats.org/drawingml/2006/picture">
+                <pic:pic>
+                  <pic:nvPicPr>
+                    <pic:cNvPr descr="figuras/fig_pragas.png" id="96" name="Picture"/>
+                    <pic:cNvPicPr>
+                      <a:picLocks noChangeArrowheads="1" noChangeAspect="1"/>
+                    </pic:cNvPicPr>
+                  </pic:nvPicPr>
+                  <pic:blipFill>
+                    <a:blip r:embed="rId94"/>
+                    <a:stretch>
+                      <a:fillRect/>
+                    </a:stretch>
+                  </pic:blipFill>
+                  <pic:spPr bwMode="auto">
+                    <a:xfrm>
+                      <a:off x="0" y="0"/>
+                      <a:ext cx="5334000" cy="2998786"/>
+                    </a:xfrm>
+                    <a:prstGeom prst="rect">
+                      <a:avLst/>
+                    </a:prstGeom>
+                    <a:noFill/>
+                    <a:ln w="9525">
+                      <a:noFill/>
+                      <a:headEnd/>
+                      <a:tailEnd/>
+                    </a:ln>
+                  </pic:spPr>
+                </pic:pic>
+              </a:graphicData>
+            </a:graphic>
+          </wp:inline>
+        </w:drawing>
+      </w:r>
+    </w:p>
+    <w:p>
+      <w:pPr>
+        <w:pStyle w:val="Fontedatabela"/>
+      </w:pPr>
+      <w:r>
+        <w:t xml:space="preserve">Fonte: dados fictícios do curso (2026).</w:t>
+      </w:r>
+    </w:p>
+    <w:p>
+      <w:pPr>
         <w:pStyle w:val="Compact"/>
         <w:numPr>
           <w:ilvl w:val="0"/>
@@ -22079,8 +22481,8 @@
         <w:t xml:space="preserve">que o pressuposto falhou. Se ela fizer a ANOVA nos dados originais e seguir em frente sem comentar o Bartlett, isso é sinal de que você precisa conferir com mais cuidado.</w:t>
       </w:r>
     </w:p>
-    <w:bookmarkEnd w:id="79"/>
-    <w:bookmarkStart w:id="80" w:name="X5582746ecc728a1ed04a4892e05210e5c999e9b"/>
+    <w:bookmarkEnd w:id="97"/>
+    <w:bookmarkStart w:id="98" w:name="X5582746ecc728a1ed04a4892e05210e5c999e9b"/>
     <w:p>
       <w:pPr>
         <w:pStyle w:val="Heading2"/>
@@ -22493,9 +22895,9 @@
         <w:br w:type="page"/>
       </w:r>
     </w:p>
-    <w:bookmarkEnd w:id="80"/>
-    <w:bookmarkEnd w:id="81"/>
-    <w:bookmarkStart w:id="87" w:name="ética-e-boas-práticas"/>
+    <w:bookmarkEnd w:id="98"/>
+    <w:bookmarkEnd w:id="99"/>
+    <w:bookmarkStart w:id="105" w:name="ética-e-boas-práticas"/>
     <w:p>
       <w:pPr>
         <w:pStyle w:val="Heading1"/>
@@ -22513,7 +22915,7 @@
         <w:t xml:space="preserve">Ética e boas práticas</w:t>
       </w:r>
     </w:p>
-    <w:bookmarkStart w:id="82" w:name="nunca-invente-dados"/>
+    <w:bookmarkStart w:id="100" w:name="nunca-invente-dados"/>
     <w:p>
       <w:pPr>
         <w:pStyle w:val="Heading2"/>
@@ -22681,8 +23083,8 @@
         <w:t xml:space="preserve">dados até dar significativo.</w:t>
       </w:r>
     </w:p>
-    <w:bookmarkEnd w:id="82"/>
-    <w:bookmarkStart w:id="83" w:name="confira-cada-resultado"/>
+    <w:bookmarkEnd w:id="100"/>
+    <w:bookmarkStart w:id="101" w:name="confira-cada-resultado"/>
     <w:p>
       <w:pPr>
         <w:pStyle w:val="Heading2"/>
@@ -22806,8 +23208,8 @@
         <w:t xml:space="preserve">sugeridas pela IA, uma por uma.</w:t>
       </w:r>
     </w:p>
-    <w:bookmarkEnd w:id="83"/>
-    <w:bookmarkStart w:id="84" w:name="declare-o-uso-de-ia"/>
+    <w:bookmarkEnd w:id="101"/>
+    <w:bookmarkStart w:id="102" w:name="declare-o-uso-de-ia"/>
     <w:p>
       <w:pPr>
         <w:pStyle w:val="Heading2"/>
@@ -22896,8 +23298,8 @@
         <w:t xml:space="preserve">, isso também deve ser declarado (geralmente nos agradecimentos ou numa nota), conforme a norma da revista.</w:t>
       </w:r>
     </w:p>
-    <w:bookmarkEnd w:id="84"/>
-    <w:bookmarkStart w:id="85" w:name="privacidade-e-proteção-de-dados"/>
+    <w:bookmarkEnd w:id="102"/>
+    <w:bookmarkStart w:id="103" w:name="privacidade-e-proteção-de-dados"/>
     <w:p>
       <w:pPr>
         <w:pStyle w:val="Heading2"/>
@@ -23049,8 +23451,8 @@
         <w:t xml:space="preserve">e o comitê de ética, quando houver pessoas envolvidas na pesquisa (entrevistas, questionários).</w:t>
       </w:r>
     </w:p>
-    <w:bookmarkEnd w:id="85"/>
-    <w:bookmarkStart w:id="86" w:name="resumo-das-boas-práticas"/>
+    <w:bookmarkEnd w:id="103"/>
+    <w:bookmarkStart w:id="104" w:name="resumo-das-boas-práticas"/>
     <w:p>
       <w:pPr>
         <w:pStyle w:val="Heading2"/>
@@ -23186,9 +23588,9 @@
         <w:br w:type="page"/>
       </w:r>
     </w:p>
-    <w:bookmarkEnd w:id="86"/>
-    <w:bookmarkEnd w:id="87"/>
-    <w:bookmarkStart w:id="88" w:name="apêndice-a-glossário"/>
+    <w:bookmarkEnd w:id="104"/>
+    <w:bookmarkEnd w:id="105"/>
+    <w:bookmarkStart w:id="106" w:name="apêndice-a-glossário"/>
     <w:p>
       <w:pPr>
         <w:pStyle w:val="Heading1"/>
@@ -23722,8 +24124,8 @@
         <w:br w:type="page"/>
       </w:r>
     </w:p>
-    <w:bookmarkEnd w:id="88"/>
-    <w:bookmarkStart w:id="89" w:name="X8cf3477aa510de75e702a2d676f685a4cf09716"/>
+    <w:bookmarkEnd w:id="106"/>
+    <w:bookmarkStart w:id="107" w:name="X8cf3477aa510de75e702a2d676f685a4cf09716"/>
     <w:p>
       <w:pPr>
         <w:pStyle w:val="Heading1"/>
@@ -23986,8 +24388,8 @@
         <w:br w:type="page"/>
       </w:r>
     </w:p>
-    <w:bookmarkEnd w:id="89"/>
-    <w:bookmarkStart w:id="94" w:name="apêndice-c-gabarito-dos-exercícios"/>
+    <w:bookmarkEnd w:id="107"/>
+    <w:bookmarkStart w:id="112" w:name="apêndice-c-gabarito-dos-exercícios"/>
     <w:p>
       <w:pPr>
         <w:pStyle w:val="Heading1"/>
@@ -24052,7 +24454,7 @@
           <w:b/>
           <w:bCs/>
         </w:rPr>
-        <w:t xml:space="preserve">As tabelas de ANOVA e de médias estão no Capítulo 6</w:t>
+        <w:t xml:space="preserve">As tabelas de ANOVA e de médias, e os gráficos, estão no Capítulo 6</w:t>
       </w:r>
       <w:r>
         <w:t xml:space="preserve">, já no padrão ABNT, para não repeti-las aqui:</w:t>
@@ -24092,7 +24494,7 @@
               <w:pStyle w:val="Compact"/>
             </w:pPr>
             <w:r>
-              <w:t xml:space="preserve">Tabelas no Capítulo 6</w:t>
+              <w:t xml:space="preserve">Tabelas e figuras no Capítulo 6</w:t>
             </w:r>
           </w:p>
         </w:tc>
@@ -24119,7 +24521,7 @@
               <w:pStyle w:val="Compact"/>
             </w:pPr>
             <w:r>
-              <w:t xml:space="preserve">Tabela 1 (ANOVA) e Tabela 2 (Tukey)</w:t>
+              <w:t xml:space="preserve">Tabela 1 (ANOVA), Tabela 2 (Tukey) e Figura 1</w:t>
             </w:r>
           </w:p>
         </w:tc>
@@ -24146,7 +24548,7 @@
               <w:pStyle w:val="Compact"/>
             </w:pPr>
             <w:r>
-              <w:t xml:space="preserve">Tabela 3 (ANOVA) e Tabela 4 (Tukey)</w:t>
+              <w:t xml:space="preserve">Tabela 3 (ANOVA), Tabela 4 (Tukey) e Figura 2</w:t>
             </w:r>
           </w:p>
         </w:tc>
@@ -24173,7 +24575,7 @@
               <w:pStyle w:val="Compact"/>
             </w:pPr>
             <w:r>
-              <w:t xml:space="preserve">Tabela 5 (ANOVA) e Tabela 6 (desdobramento)</w:t>
+              <w:t xml:space="preserve">Tabela 5 (ANOVA), Tabela 6 (desdobramento) e Figura 3</w:t>
             </w:r>
           </w:p>
         </w:tc>
@@ -24200,7 +24602,7 @@
               <w:pStyle w:val="Compact"/>
             </w:pPr>
             <w:r>
-              <w:t xml:space="preserve">Tabela 7 (ANOVA) e Tabela 8 (cultivares em cada sombreamento)</w:t>
+              <w:t xml:space="preserve">Tabela 7 (ANOVA), Tabela 8 (cultivares em cada sombreamento) e Figura 4</w:t>
             </w:r>
           </w:p>
         </w:tc>
@@ -24227,7 +24629,7 @@
               <w:pStyle w:val="Compact"/>
             </w:pPr>
             <w:r>
-              <w:t xml:space="preserve">Tabela 9 (ANOVA com regressão), Tabela 10 (médias) e Figura 1</w:t>
+              <w:t xml:space="preserve">Tabela 9 (ANOVA com regressão), Tabela 10 (médias) e Figura 5</w:t>
             </w:r>
           </w:p>
         </w:tc>
@@ -24254,7 +24656,7 @@
               <w:pStyle w:val="Compact"/>
             </w:pPr>
             <w:r>
-              <w:t xml:space="preserve">Tabelas 11 e 12 (ANOVA original e transformada) e Tabela 13 (médias)</w:t>
+              <w:t xml:space="preserve">Tabelas 11 e 12 (ANOVA original e transformada), Tabela 13 (médias) e Figura 6</w:t>
             </w:r>
           </w:p>
         </w:tc>
@@ -24268,7 +24670,7 @@
         <w:t xml:space="preserve">Este apêndice traz os detalhes que não cabem nas tabelas: p-valores exatos, pressupostos e modelos de regressão.</w:t>
       </w:r>
     </w:p>
-    <w:bookmarkStart w:id="90" w:name="p-valores-do-teste-f"/>
+    <w:bookmarkStart w:id="108" w:name="p-valores-do-teste-f"/>
     <w:p>
       <w:pPr>
         <w:pStyle w:val="Heading2"/>
@@ -25127,8 +25529,8 @@
         <w:t xml:space="preserve">para o fatorial, a coluna QM aparece com valores incorretos de exibição (4, 2, 5, 3); os QM corretos (SQ/GL) estão na Tabela 5 e conferem com o F mostrado.</w:t>
       </w:r>
     </w:p>
-    <w:bookmarkEnd w:id="90"/>
-    <w:bookmarkStart w:id="91" w:name="pressupostos"/>
+    <w:bookmarkEnd w:id="108"/>
+    <w:bookmarkStart w:id="109" w:name="pressupostos"/>
     <w:p>
       <w:pPr>
         <w:pStyle w:val="Heading2"/>
@@ -25517,8 +25919,8 @@
         </w:tc>
       </w:tr>
     </w:tbl>
-    <w:bookmarkEnd w:id="91"/>
-    <w:bookmarkStart w:id="92" w:name="detalhes-dos-testes-de-médias"/>
+    <w:bookmarkEnd w:id="109"/>
+    <w:bookmarkStart w:id="110" w:name="detalhes-dos-testes-de-médias"/>
     <w:p>
       <w:pPr>
         <w:pStyle w:val="Heading2"/>
@@ -25608,8 +26010,8 @@
         <w:t xml:space="preserve">.</w:t>
       </w:r>
     </w:p>
-    <w:bookmarkEnd w:id="92"/>
-    <w:bookmarkStart w:id="93" w:name="regressão-exercício-5"/>
+    <w:bookmarkEnd w:id="110"/>
+    <w:bookmarkStart w:id="111" w:name="regressão-exercício-5"/>
     <w:p>
       <w:pPr>
         <w:pStyle w:val="Heading2"/>
@@ -25949,8 +26351,8 @@
         <w:t xml:space="preserve">Bom trabalho e bons experimentos!</w:t>
       </w:r>
     </w:p>
-    <w:bookmarkEnd w:id="93"/>
-    <w:bookmarkEnd w:id="94"/>
+    <w:bookmarkEnd w:id="111"/>
+    <w:bookmarkEnd w:id="112"/>
     <w:sectPr>
       <w:footnotePr>
         <w:numRestart w:val="eachSect"/>
@@ -27400,6 +27802,11 @@
   <w:style w:customStyle="1" w:styleId="Figure" w:type="paragraph">
     <w:name w:val="Figure"/>
     <w:basedOn w:val="Normal"/>
+    <w:pPr>
+      <w:keepNext/>
+      <w:spacing w:before="0" w:after="60"/>
+      <w:jc w:val="center"/>
+    </w:pPr>
   </w:style>
   <w:style w:customStyle="1" w:styleId="CaptionedFigure" w:type="paragraph">
     <w:name w:val="Captioned Figure"/>

</xml_diff>